<commit_message>
time scenario excel and review
</commit_message>
<xml_diff>
--- a/doc/O2C Time V0.3.docx
+++ b/doc/O2C Time V0.3.docx
@@ -15639,6 +15639,9 @@
           <w:numId w:val="20"/>
         </w:numPr>
         <w:jc w:val="both"/>
+        <w:rPr>
+          <w:highlight w:val="yellow"/>
+        </w:rPr>
       </w:pPr>
       <w:r>
         <w:t xml:space="preserve">On the payroll cut-off date, the system </w:t>
@@ -15647,7 +15650,13 @@
         <w:t>should</w:t>
       </w:r>
       <w:r>
-        <w:t xml:space="preserve"> identify all employees and contractors who have not submitted their timesheets or whose timesheets are not approved by their manager, based on the applicable business rules.</w:t>
+        <w:t xml:space="preserve"> identify all employees and contractors who have not submitted their timesheets or whose timesheets are not approved by their manager, </w:t>
+      </w:r>
+      <w:r>
+        <w:rPr>
+          <w:highlight w:val="yellow"/>
+        </w:rPr>
+        <w:t>based on the applicable business rules.</w:t>
       </w:r>
     </w:p>
     <w:p>
@@ -15738,7 +15747,16 @@
         <w:t>should</w:t>
       </w:r>
       <w:r>
-        <w:t xml:space="preserve"> provide a screen where an employee can view the dates for which timesheets have not been submitted.</w:t>
+        <w:t xml:space="preserve"> </w:t>
+      </w:r>
+      <w:r>
+        <w:rPr>
+          <w:highlight w:val="yellow"/>
+        </w:rPr>
+        <w:t>provide a screen</w:t>
+      </w:r>
+      <w:r>
+        <w:t xml:space="preserve"> where an employee can view the dates for which timesheets have not been submitted.</w:t>
       </w:r>
     </w:p>
     <w:p>
@@ -20736,10 +20754,21 @@
 </file>
 
 <file path=customXml/item1.xml><?xml version="1.0" encoding="utf-8"?>
-<b:Sources xmlns:b="http://schemas.openxmlformats.org/officeDocument/2006/bibliography" xmlns="http://schemas.openxmlformats.org/officeDocument/2006/bibliography" SelectedStyle="\APASixthEditionOfficeOnline.xsl" StyleName="APA" Version="6"/>
+<p:properties xmlns:p="http://schemas.microsoft.com/office/2006/metadata/properties" xmlns:xsi="http://www.w3.org/2001/XMLSchema-instance" xmlns:pc="http://schemas.microsoft.com/office/infopath/2007/PartnerControls">
+  <documentManagement/>
+</p:properties>
 </file>
 
 <file path=customXml/item2.xml><?xml version="1.0" encoding="utf-8"?>
+<?mso-contentType ?>
+<FormTemplates xmlns="http://schemas.microsoft.com/sharepoint/v3/contenttype/forms">
+  <Display>DocumentLibraryForm</Display>
+  <Edit>DocumentLibraryForm</Edit>
+  <New>DocumentLibraryForm</New>
+</FormTemplates>
+</file>
+
+<file path=customXml/item3.xml><?xml version="1.0" encoding="utf-8"?>
 <ct:contentTypeSchema xmlns:ct="http://schemas.microsoft.com/office/2006/metadata/contentType" xmlns:ma="http://schemas.microsoft.com/office/2006/metadata/properties/metaAttributes" ct:_="" ma:_="" ma:contentTypeName="Document" ma:contentTypeID="0x010100141825638AF68E48BE51BAB791418D9F" ma:contentTypeVersion="3" ma:contentTypeDescription="Create a new document." ma:contentTypeScope="" ma:versionID="33a744e8e9136eefcbb6d8203aae5735">
   <xsd:schema xmlns:xsd="http://www.w3.org/2001/XMLSchema" xmlns:xs="http://www.w3.org/2001/XMLSchema" xmlns:p="http://schemas.microsoft.com/office/2006/metadata/properties" xmlns:ns2="36b65478-844c-4614-a56e-bc6723dfd221" targetNamespace="http://schemas.microsoft.com/office/2006/metadata/properties" ma:root="true" ma:fieldsID="b544eb9bce084332635676c59eb545c8" ns2:_="">
     <xsd:import namespace="36b65478-844c-4614-a56e-bc6723dfd221"/>
@@ -20877,30 +20906,28 @@
 </ct:contentTypeSchema>
 </file>
 
-<file path=customXml/item3.xml><?xml version="1.0" encoding="utf-8"?>
-<?mso-contentType ?>
-<FormTemplates xmlns="http://schemas.microsoft.com/sharepoint/v3/contenttype/forms">
-  <Display>DocumentLibraryForm</Display>
-  <Edit>DocumentLibraryForm</Edit>
-  <New>DocumentLibraryForm</New>
-</FormTemplates>
-</file>
-
 <file path=customXml/item4.xml><?xml version="1.0" encoding="utf-8"?>
-<p:properties xmlns:p="http://schemas.microsoft.com/office/2006/metadata/properties" xmlns:xsi="http://www.w3.org/2001/XMLSchema-instance" xmlns:pc="http://schemas.microsoft.com/office/infopath/2007/PartnerControls">
-  <documentManagement/>
-</p:properties>
+<b:Sources xmlns:b="http://schemas.openxmlformats.org/officeDocument/2006/bibliography" xmlns="http://schemas.openxmlformats.org/officeDocument/2006/bibliography" SelectedStyle="\APASixthEditionOfficeOnline.xsl" StyleName="APA" Version="6"/>
 </file>
 
 <file path=customXml/itemProps1.xml><?xml version="1.0" encoding="utf-8"?>
-<ds:datastoreItem xmlns:ds="http://schemas.openxmlformats.org/officeDocument/2006/customXml" ds:itemID="{113CE2FA-1CBD-4735-AA29-E494DA0ACDAE}">
+<ds:datastoreItem xmlns:ds="http://schemas.openxmlformats.org/officeDocument/2006/customXml" ds:itemID="{A8139164-8843-4705-8CEF-956DC84EFEB9}">
   <ds:schemaRefs>
-    <ds:schemaRef ds:uri="http://schemas.openxmlformats.org/officeDocument/2006/bibliography"/>
+    <ds:schemaRef ds:uri="http://schemas.microsoft.com/office/2006/metadata/properties"/>
+    <ds:schemaRef ds:uri="http://schemas.microsoft.com/office/infopath/2007/PartnerControls"/>
   </ds:schemaRefs>
 </ds:datastoreItem>
 </file>
 
 <file path=customXml/itemProps2.xml><?xml version="1.0" encoding="utf-8"?>
+<ds:datastoreItem xmlns:ds="http://schemas.openxmlformats.org/officeDocument/2006/customXml" ds:itemID="{16386BB6-CA42-479E-9DFC-0AF022F68874}">
+  <ds:schemaRefs>
+    <ds:schemaRef ds:uri="http://schemas.microsoft.com/sharepoint/v3/contenttype/forms"/>
+  </ds:schemaRefs>
+</ds:datastoreItem>
+</file>
+
+<file path=customXml/itemProps3.xml><?xml version="1.0" encoding="utf-8"?>
 <ds:datastoreItem xmlns:ds="http://schemas.openxmlformats.org/officeDocument/2006/customXml" ds:itemID="{A747A389-7ACD-4C7E-A092-4A4F81889B03}">
   <ds:schemaRefs>
     <ds:schemaRef ds:uri="http://schemas.microsoft.com/office/2006/metadata/contentType"/>
@@ -20918,19 +20945,10 @@
 </ds:datastoreItem>
 </file>
 
-<file path=customXml/itemProps3.xml><?xml version="1.0" encoding="utf-8"?>
-<ds:datastoreItem xmlns:ds="http://schemas.openxmlformats.org/officeDocument/2006/customXml" ds:itemID="{16386BB6-CA42-479E-9DFC-0AF022F68874}">
+<file path=customXml/itemProps4.xml><?xml version="1.0" encoding="utf-8"?>
+<ds:datastoreItem xmlns:ds="http://schemas.openxmlformats.org/officeDocument/2006/customXml" ds:itemID="{113CE2FA-1CBD-4735-AA29-E494DA0ACDAE}">
   <ds:schemaRefs>
-    <ds:schemaRef ds:uri="http://schemas.microsoft.com/sharepoint/v3/contenttype/forms"/>
-  </ds:schemaRefs>
-</ds:datastoreItem>
-</file>
-
-<file path=customXml/itemProps4.xml><?xml version="1.0" encoding="utf-8"?>
-<ds:datastoreItem xmlns:ds="http://schemas.openxmlformats.org/officeDocument/2006/customXml" ds:itemID="{A8139164-8843-4705-8CEF-956DC84EFEB9}">
-  <ds:schemaRefs>
-    <ds:schemaRef ds:uri="http://schemas.microsoft.com/office/2006/metadata/properties"/>
-    <ds:schemaRef ds:uri="http://schemas.microsoft.com/office/infopath/2007/PartnerControls"/>
+    <ds:schemaRef ds:uri="http://schemas.openxmlformats.org/officeDocument/2006/bibliography"/>
   </ds:schemaRefs>
 </ds:datastoreItem>
 </file>
</xml_diff>